<commit_message>
crosschecked all the exhibit combinations
</commit_message>
<xml_diff>
--- a/backend-exhibits/Outlook to Outlook Standard Plan - Standard Not Include.docx
+++ b/backend-exhibits/Outlook to Outlook Standard Plan - Standard Not Include.docx
@@ -45,32 +45,28 @@
               <w:spacing w:line="240" w:lineRule="auto"/>
               <w:jc w:val="center"/>
               <w:rPr>
-                <w:rFonts w:ascii="Arial" w:hAnsi="Arial" w:cs="Arial" w:eastAsia="Arial"/>
                 <w:b/>
                 <w:bCs/>
-                <w:sz w:val="21"/>
-                <w:szCs w:val="21"/>
               </w:rPr>
             </w:pPr>
             <w:r>
               <w:rPr>
-                <w:rFonts w:ascii="Arial" w:hAnsi="Arial" w:cs="Arial" w:eastAsia="Arial"/>
                 <w:b/>
                 <w:bCs/>
-                <w:sz w:val="21"/>
-                <w:szCs w:val="21"/>
               </w:rPr>
-              <w:t>Gmail to Outlook Out of scope Features</w:t>
+              <w:t>Outlook</w:t>
+            </w:r>
+            <w:r>
+              <w:rPr>
+                <w:b/>
+                <w:bCs/>
+              </w:rPr>
+              <w:t xml:space="preserve"> to Outlook Out of scope Features</w:t>
             </w:r>
           </w:p>
           <w:p>
             <w:pPr>
               <w:ind w:left="3"/>
-              <w:rPr>
-                <w:rFonts w:ascii="Arial" w:hAnsi="Arial" w:cs="Arial" w:eastAsia="Arial"/>
-                <w:sz w:val="21"/>
-                <w:szCs w:val="21"/>
-              </w:rPr>
             </w:pPr>
           </w:p>
         </w:tc>
@@ -92,18 +88,8 @@
           <w:p>
             <w:pPr>
               <w:spacing w:line="240" w:lineRule="auto"/>
-              <w:rPr>
-                <w:rFonts w:ascii="Arial" w:hAnsi="Arial" w:cs="Arial" w:eastAsia="Arial"/>
-                <w:sz w:val="21"/>
-                <w:szCs w:val="21"/>
-              </w:rPr>
             </w:pPr>
             <w:r>
-              <w:rPr>
-                <w:rFonts w:ascii="Arial" w:hAnsi="Arial" w:cs="Arial" w:eastAsia="Arial"/>
-                <w:sz w:val="21"/>
-                <w:szCs w:val="21"/>
-              </w:rPr>
               <w:t>Junk mails </w:t>
             </w:r>
           </w:p>
@@ -121,18 +107,8 @@
           <w:p>
             <w:pPr>
               <w:spacing w:line="240" w:lineRule="auto"/>
-              <w:rPr>
-                <w:rFonts w:ascii="Arial" w:hAnsi="Arial" w:cs="Arial" w:eastAsia="Arial"/>
-                <w:sz w:val="21"/>
-                <w:szCs w:val="21"/>
-              </w:rPr>
             </w:pPr>
             <w:r>
-              <w:rPr>
-                <w:rFonts w:ascii="Arial" w:hAnsi="Arial" w:cs="Arial" w:eastAsia="Arial"/>
-                <w:sz w:val="21"/>
-                <w:szCs w:val="21"/>
-              </w:rPr>
               <w:t>Unwanted emails, typically containing spam or irrelevant content, are often filtered into a separate folder to reduce clutter in the inbox. </w:t>
             </w:r>
           </w:p>
@@ -155,18 +131,8 @@
           <w:p>
             <w:pPr>
               <w:spacing w:line="240" w:lineRule="auto"/>
-              <w:rPr>
-                <w:rFonts w:ascii="Arial" w:hAnsi="Arial" w:cs="Arial" w:eastAsia="Arial"/>
-                <w:sz w:val="21"/>
-                <w:szCs w:val="21"/>
-              </w:rPr>
             </w:pPr>
             <w:r>
-              <w:rPr>
-                <w:rFonts w:ascii="Arial" w:hAnsi="Arial" w:cs="Arial" w:eastAsia="Arial"/>
-                <w:sz w:val="21"/>
-                <w:szCs w:val="21"/>
-              </w:rPr>
               <w:t>Calendar event attachments </w:t>
             </w:r>
           </w:p>
@@ -184,18 +150,8 @@
           <w:p>
             <w:pPr>
               <w:spacing w:line="240" w:lineRule="auto"/>
-              <w:rPr>
-                <w:rFonts w:ascii="Arial" w:hAnsi="Arial" w:cs="Arial" w:eastAsia="Arial"/>
-                <w:sz w:val="21"/>
-                <w:szCs w:val="21"/>
-              </w:rPr>
             </w:pPr>
             <w:r>
-              <w:rPr>
-                <w:rFonts w:ascii="Arial" w:hAnsi="Arial" w:cs="Arial" w:eastAsia="Arial"/>
-                <w:sz w:val="21"/>
-                <w:szCs w:val="21"/>
-              </w:rPr>
               <w:t>Calendar event attachments will maintain </w:t>
             </w:r>
           </w:p>
@@ -217,7 +173,7 @@
   <w:docDefaults>
     <w:rPrDefault>
       <w:rPr>
-        <w:rFonts w:ascii="Arial" w:hAnsi="Arial" w:cs="Arial" w:eastAsia="Arial"/>
+        <w:rFonts w:ascii="Arial" w:eastAsia="Arial" w:hAnsi="Arial" w:cs="Arial"/>
         <w:kern w:val="2"/>
         <w:sz w:val="21"/>
         <w:szCs w:val="21"/>
@@ -616,9 +572,7 @@
       <w:spacing w:line="259" w:lineRule="auto"/>
     </w:pPr>
     <w:rPr>
-      <w:rFonts w:ascii="Arial" w:hAnsi="Arial" w:cs="Arial" w:eastAsia="Arial"/>
       <w:color w:val="000000"/>
-      <w:sz w:val="21"/>
     </w:rPr>
   </w:style>
   <w:style w:type="character" w:default="1" w:styleId="DefaultParagraphFont">

</xml_diff>